<commit_message>
letterhead foot carries only the domain on the right
</commit_message>
<xml_diff>
--- a/branding/letterhead/letterhead.docx
+++ b/branding/letterhead/letterhead.docx
@@ -31,27 +31,13 @@
     </w:pPr>
   </w:p>
   <w:p>
+    <w:pPr>
+      <w:jc w:val="right"/>
+    </w:pPr>
     <w:r>
       <w:rPr>
         <w:rFonts w:ascii="Consolas" w:hAnsi="Consolas"/>
         <w:color w:val="B0ACBA"/>
-        <w:sz w:val="16"/>
-      </w:rPr>
-      <w:t>hello@victorlepri.com   +1 (240) 535-3958</w:t>
-    </w:r>
-    <w:r>
-      <w:rPr>
-        <w:rFonts w:ascii="Consolas" w:hAnsi="Consolas"/>
-        <w:color w:val="B0ACBA"/>
-        <w:sz w:val="16"/>
-      </w:rPr>
-      <w:tab/>
-      <w:tab/>
-    </w:r>
-    <w:r>
-      <w:rPr>
-        <w:rFonts w:ascii="Consolas" w:hAnsi="Consolas"/>
-        <w:color w:val="C41555"/>
         <w:sz w:val="16"/>
       </w:rPr>
       <w:t>victorlepri.com</w:t>

</xml_diff>